<commit_message>
Bug fixes, lots and lots of new code. Clean up. Merging MeMRI PTB Scripts with App-Designer GUI instead of GUIDE.
</commit_message>
<xml_diff>
--- a/Documents/Illuminate_MeMRI_Toolbox_Quick_Guide.docx
+++ b/Documents/Illuminate_MeMRI_Toolbox_Quick_Guide.docx
@@ -19,6 +19,12 @@
         <w:rPr>
           <w:lang w:val="en-US"/>
         </w:rPr>
+        <w:t xml:space="preserve">Start </w:t>
+      </w:r>
+      <w:r>
+        <w:rPr>
+          <w:lang w:val="en-US"/>
+        </w:rPr>
         <w:t>G</w:t>
       </w:r>
       <w:r>
@@ -39,19 +45,55 @@
         <w:rPr>
           <w:lang w:val="en-US"/>
         </w:rPr>
-        <w:t>Short and concise guide to enable</w:t>
+        <w:t>A s</w:t>
       </w:r>
       <w:r>
         <w:rPr>
           <w:lang w:val="en-US"/>
         </w:rPr>
-        <w:t xml:space="preserve"> loading and</w:t>
+        <w:t>hort and concise guide to enable</w:t>
       </w:r>
       <w:r>
         <w:rPr>
           <w:lang w:val="en-US"/>
         </w:rPr>
-        <w:t xml:space="preserve"> processing of raw metabolic imaging data from both Siemens and Philips MR platforms</w:t>
+        <w:t xml:space="preserve"> </w:t>
+      </w:r>
+      <w:r>
+        <w:rPr>
+          <w:lang w:val="en-US"/>
+        </w:rPr>
+        <w:t xml:space="preserve">converting, </w:t>
+      </w:r>
+      <w:r>
+        <w:rPr>
+          <w:lang w:val="en-US"/>
+        </w:rPr>
+        <w:t>processing</w:t>
+      </w:r>
+      <w:r>
+        <w:rPr>
+          <w:lang w:val="en-US"/>
+        </w:rPr>
+        <w:t>, quantifying and visualizing</w:t>
+      </w:r>
+      <w:r>
+        <w:rPr>
+          <w:lang w:val="en-US"/>
+        </w:rPr>
+        <w:t xml:space="preserve"> raw</w:t>
+      </w:r>
+      <w:r>
+        <w:rPr>
+          <w:lang w:val="en-US"/>
+        </w:rPr>
+        <w:t>-export</w:t>
+      </w:r>
+      <w:r>
+        <w:rPr>
+          <w:lang w:val="en-US"/>
+        </w:rPr>
+        <w:t xml:space="preserve"> metabolic imaging data from both Siemens and Philips MR platforms</w:t>
       </w:r>
       <w:r>
         <w:rPr>
@@ -62,6 +104,15 @@
     </w:p>
     <w:sdt>
       <w:sdtPr>
+        <w:rPr>
+          <w:rFonts w:asciiTheme="minorHAnsi" w:eastAsiaTheme="minorHAnsi" w:hAnsiTheme="minorHAnsi" w:cstheme="minorBidi"/>
+          <w:color w:val="auto"/>
+          <w:kern w:val="2"/>
+          <w:sz w:val="24"/>
+          <w:szCs w:val="24"/>
+          <w:lang/>
+          <w14:ligatures w14:val="standardContextual"/>
+        </w:rPr>
         <w:id w:val="-381715247"/>
         <w:docPartObj>
           <w:docPartGallery w:val="Table of Contents"/>
@@ -70,16 +121,9 @@
       </w:sdtPr>
       <w:sdtEndPr>
         <w:rPr>
-          <w:rFonts w:asciiTheme="minorHAnsi" w:eastAsiaTheme="minorHAnsi" w:hAnsiTheme="minorHAnsi" w:cstheme="minorBidi"/>
           <w:b/>
           <w:bCs/>
           <w:noProof/>
-          <w:color w:val="auto"/>
-          <w:kern w:val="2"/>
-          <w:sz w:val="24"/>
-          <w:szCs w:val="24"/>
-          <w:lang/>
-          <w14:ligatures w14:val="standardContextual"/>
         </w:rPr>
       </w:sdtEndPr>
       <w:sdtContent>
@@ -118,7 +162,7 @@
           <w:r>
             <w:fldChar w:fldCharType="separate"/>
           </w:r>
-          <w:hyperlink w:anchor="_Toc228799182" w:history="1">
+          <w:hyperlink w:anchor="_Toc231916329" w:history="1">
             <w:r>
               <w:rPr>
                 <w:rStyle w:val="Hyperlink"/>
@@ -146,7 +190,7 @@
                 <w:noProof/>
                 <w:webHidden/>
               </w:rPr>
-              <w:instrText xml:space="preserve"> PAGEREF _Toc228799182 \h </w:instrText>
+              <w:instrText xml:space="preserve"> PAGEREF _Toc231916329 \h </w:instrText>
             </w:r>
             <w:r>
               <w:rPr>
@@ -189,14 +233,14 @@
               <w:lang/>
             </w:rPr>
           </w:pPr>
-          <w:hyperlink w:anchor="_Toc228799183" w:history="1">
+          <w:hyperlink w:anchor="_Toc231916330" w:history="1">
             <w:r>
               <w:rPr>
                 <w:rStyle w:val="Hyperlink"/>
                 <w:noProof/>
                 <w:lang w:val="it-IT"/>
               </w:rPr>
-              <w:t>Git &amp; Github</w:t>
+              <w:t>Github in MATLAB</w:t>
             </w:r>
             <w:r>
               <w:rPr>
@@ -217,7 +261,7 @@
                 <w:noProof/>
                 <w:webHidden/>
               </w:rPr>
-              <w:instrText xml:space="preserve"> PAGEREF _Toc228799183 \h </w:instrText>
+              <w:instrText xml:space="preserve"> PAGEREF _Toc231916330 \h </w:instrText>
             </w:r>
             <w:r>
               <w:rPr>
@@ -260,14 +304,14 @@
               <w:lang/>
             </w:rPr>
           </w:pPr>
-          <w:hyperlink w:anchor="_Toc228799184" w:history="1">
+          <w:hyperlink w:anchor="_Toc231916331" w:history="1">
             <w:r>
               <w:rPr>
                 <w:rStyle w:val="Hyperlink"/>
                 <w:noProof/>
                 <w:lang w:val="it-IT"/>
               </w:rPr>
-              <w:t>Load Data</w:t>
+              <w:t>Framework Explained</w:t>
             </w:r>
             <w:r>
               <w:rPr>
@@ -288,7 +332,7 @@
                 <w:noProof/>
                 <w:webHidden/>
               </w:rPr>
-              <w:instrText xml:space="preserve"> PAGEREF _Toc228799184 \h </w:instrText>
+              <w:instrText xml:space="preserve"> PAGEREF _Toc231916331 \h </w:instrText>
             </w:r>
             <w:r>
               <w:rPr>
@@ -308,7 +352,291 @@
                 <w:noProof/>
                 <w:webHidden/>
               </w:rPr>
-              <w:t>1</w:t>
+              <w:t>2</w:t>
+            </w:r>
+            <w:r>
+              <w:rPr>
+                <w:noProof/>
+                <w:webHidden/>
+              </w:rPr>
+              <w:fldChar w:fldCharType="end"/>
+            </w:r>
+          </w:hyperlink>
+        </w:p>
+        <w:p>
+          <w:pPr>
+            <w:pStyle w:val="TOC3"/>
+            <w:tabs>
+              <w:tab w:val="right" w:leader="dot" w:pos="9016"/>
+            </w:tabs>
+            <w:rPr>
+              <w:rFonts w:eastAsiaTheme="minorEastAsia"/>
+              <w:noProof/>
+              <w:lang/>
+            </w:rPr>
+          </w:pPr>
+          <w:hyperlink w:anchor="_Toc231916332" w:history="1">
+            <w:r>
+              <w:rPr>
+                <w:rStyle w:val="Hyperlink"/>
+                <w:noProof/>
+                <w:lang w:val="it-IT"/>
+              </w:rPr>
+              <w:t>Loading raw data</w:t>
+            </w:r>
+            <w:r>
+              <w:rPr>
+                <w:noProof/>
+                <w:webHidden/>
+              </w:rPr>
+              <w:tab/>
+            </w:r>
+            <w:r>
+              <w:rPr>
+                <w:noProof/>
+                <w:webHidden/>
+              </w:rPr>
+              <w:fldChar w:fldCharType="begin"/>
+            </w:r>
+            <w:r>
+              <w:rPr>
+                <w:noProof/>
+                <w:webHidden/>
+              </w:rPr>
+              <w:instrText xml:space="preserve"> PAGEREF _Toc231916332 \h </w:instrText>
+            </w:r>
+            <w:r>
+              <w:rPr>
+                <w:noProof/>
+                <w:webHidden/>
+              </w:rPr>
+            </w:r>
+            <w:r>
+              <w:rPr>
+                <w:noProof/>
+                <w:webHidden/>
+              </w:rPr>
+              <w:fldChar w:fldCharType="separate"/>
+            </w:r>
+            <w:r>
+              <w:rPr>
+                <w:noProof/>
+                <w:webHidden/>
+              </w:rPr>
+              <w:t>2</w:t>
+            </w:r>
+            <w:r>
+              <w:rPr>
+                <w:noProof/>
+                <w:webHidden/>
+              </w:rPr>
+              <w:fldChar w:fldCharType="end"/>
+            </w:r>
+          </w:hyperlink>
+        </w:p>
+        <w:p>
+          <w:pPr>
+            <w:pStyle w:val="TOC3"/>
+            <w:tabs>
+              <w:tab w:val="right" w:leader="dot" w:pos="9016"/>
+            </w:tabs>
+            <w:rPr>
+              <w:rFonts w:eastAsiaTheme="minorEastAsia"/>
+              <w:noProof/>
+              <w:lang/>
+            </w:rPr>
+          </w:pPr>
+          <w:hyperlink w:anchor="_Toc231916333" w:history="1">
+            <w:r>
+              <w:rPr>
+                <w:rStyle w:val="Hyperlink"/>
+                <w:noProof/>
+                <w:lang w:val="it-IT"/>
+              </w:rPr>
+              <w:t>Processing</w:t>
+            </w:r>
+            <w:r>
+              <w:rPr>
+                <w:noProof/>
+                <w:webHidden/>
+              </w:rPr>
+              <w:tab/>
+            </w:r>
+            <w:r>
+              <w:rPr>
+                <w:noProof/>
+                <w:webHidden/>
+              </w:rPr>
+              <w:fldChar w:fldCharType="begin"/>
+            </w:r>
+            <w:r>
+              <w:rPr>
+                <w:noProof/>
+                <w:webHidden/>
+              </w:rPr>
+              <w:instrText xml:space="preserve"> PAGEREF _Toc231916333 \h </w:instrText>
+            </w:r>
+            <w:r>
+              <w:rPr>
+                <w:noProof/>
+                <w:webHidden/>
+              </w:rPr>
+            </w:r>
+            <w:r>
+              <w:rPr>
+                <w:noProof/>
+                <w:webHidden/>
+              </w:rPr>
+              <w:fldChar w:fldCharType="separate"/>
+            </w:r>
+            <w:r>
+              <w:rPr>
+                <w:noProof/>
+                <w:webHidden/>
+              </w:rPr>
+              <w:t>2</w:t>
+            </w:r>
+            <w:r>
+              <w:rPr>
+                <w:noProof/>
+                <w:webHidden/>
+              </w:rPr>
+              <w:fldChar w:fldCharType="end"/>
+            </w:r>
+          </w:hyperlink>
+        </w:p>
+        <w:p>
+          <w:pPr>
+            <w:pStyle w:val="TOC3"/>
+            <w:tabs>
+              <w:tab w:val="right" w:leader="dot" w:pos="9016"/>
+            </w:tabs>
+            <w:rPr>
+              <w:rFonts w:eastAsiaTheme="minorEastAsia"/>
+              <w:noProof/>
+              <w:lang/>
+            </w:rPr>
+          </w:pPr>
+          <w:hyperlink w:anchor="_Toc231916334" w:history="1">
+            <w:r>
+              <w:rPr>
+                <w:rStyle w:val="Hyperlink"/>
+                <w:noProof/>
+                <w:lang w:val="it-IT"/>
+              </w:rPr>
+              <w:t>Visualization</w:t>
+            </w:r>
+            <w:r>
+              <w:rPr>
+                <w:noProof/>
+                <w:webHidden/>
+              </w:rPr>
+              <w:tab/>
+            </w:r>
+            <w:r>
+              <w:rPr>
+                <w:noProof/>
+                <w:webHidden/>
+              </w:rPr>
+              <w:fldChar w:fldCharType="begin"/>
+            </w:r>
+            <w:r>
+              <w:rPr>
+                <w:noProof/>
+                <w:webHidden/>
+              </w:rPr>
+              <w:instrText xml:space="preserve"> PAGEREF _Toc231916334 \h </w:instrText>
+            </w:r>
+            <w:r>
+              <w:rPr>
+                <w:noProof/>
+                <w:webHidden/>
+              </w:rPr>
+            </w:r>
+            <w:r>
+              <w:rPr>
+                <w:noProof/>
+                <w:webHidden/>
+              </w:rPr>
+              <w:fldChar w:fldCharType="separate"/>
+            </w:r>
+            <w:r>
+              <w:rPr>
+                <w:noProof/>
+                <w:webHidden/>
+              </w:rPr>
+              <w:t>3</w:t>
+            </w:r>
+            <w:r>
+              <w:rPr>
+                <w:noProof/>
+                <w:webHidden/>
+              </w:rPr>
+              <w:fldChar w:fldCharType="end"/>
+            </w:r>
+          </w:hyperlink>
+        </w:p>
+        <w:p>
+          <w:pPr>
+            <w:pStyle w:val="TOC3"/>
+            <w:tabs>
+              <w:tab w:val="right" w:leader="dot" w:pos="9016"/>
+            </w:tabs>
+            <w:rPr>
+              <w:rFonts w:eastAsiaTheme="minorEastAsia"/>
+              <w:noProof/>
+              <w:lang/>
+            </w:rPr>
+          </w:pPr>
+          <w:hyperlink w:anchor="_Toc231916335" w:history="1">
+            <w:r>
+              <w:rPr>
+                <w:rStyle w:val="Hyperlink"/>
+                <w:noProof/>
+                <w:lang w:val="it-IT"/>
+              </w:rPr>
+              <w:t>Quantification</w:t>
+            </w:r>
+            <w:r>
+              <w:rPr>
+                <w:noProof/>
+                <w:webHidden/>
+              </w:rPr>
+              <w:tab/>
+            </w:r>
+            <w:r>
+              <w:rPr>
+                <w:noProof/>
+                <w:webHidden/>
+              </w:rPr>
+              <w:fldChar w:fldCharType="begin"/>
+            </w:r>
+            <w:r>
+              <w:rPr>
+                <w:noProof/>
+                <w:webHidden/>
+              </w:rPr>
+              <w:instrText xml:space="preserve"> PAGEREF _Toc231916335 \h </w:instrText>
+            </w:r>
+            <w:r>
+              <w:rPr>
+                <w:noProof/>
+                <w:webHidden/>
+              </w:rPr>
+            </w:r>
+            <w:r>
+              <w:rPr>
+                <w:noProof/>
+                <w:webHidden/>
+              </w:rPr>
+              <w:fldChar w:fldCharType="separate"/>
+            </w:r>
+            <w:r>
+              <w:rPr>
+                <w:noProof/>
+                <w:webHidden/>
+              </w:rPr>
+              <w:t>3</w:t>
             </w:r>
             <w:r>
               <w:rPr>
@@ -331,11 +659,82 @@
               <w:lang/>
             </w:rPr>
           </w:pPr>
-          <w:hyperlink w:anchor="_Toc228799185" w:history="1">
+          <w:hyperlink w:anchor="_Toc231916336" w:history="1">
             <w:r>
               <w:rPr>
                 <w:rStyle w:val="Hyperlink"/>
                 <w:noProof/>
+                <w:lang w:val="it-IT"/>
+              </w:rPr>
+              <w:t>Data Converter (Load)</w:t>
+            </w:r>
+            <w:r>
+              <w:rPr>
+                <w:noProof/>
+                <w:webHidden/>
+              </w:rPr>
+              <w:tab/>
+            </w:r>
+            <w:r>
+              <w:rPr>
+                <w:noProof/>
+                <w:webHidden/>
+              </w:rPr>
+              <w:fldChar w:fldCharType="begin"/>
+            </w:r>
+            <w:r>
+              <w:rPr>
+                <w:noProof/>
+                <w:webHidden/>
+              </w:rPr>
+              <w:instrText xml:space="preserve"> PAGEREF _Toc231916336 \h </w:instrText>
+            </w:r>
+            <w:r>
+              <w:rPr>
+                <w:noProof/>
+                <w:webHidden/>
+              </w:rPr>
+            </w:r>
+            <w:r>
+              <w:rPr>
+                <w:noProof/>
+                <w:webHidden/>
+              </w:rPr>
+              <w:fldChar w:fldCharType="separate"/>
+            </w:r>
+            <w:r>
+              <w:rPr>
+                <w:noProof/>
+                <w:webHidden/>
+              </w:rPr>
+              <w:t>3</w:t>
+            </w:r>
+            <w:r>
+              <w:rPr>
+                <w:noProof/>
+                <w:webHidden/>
+              </w:rPr>
+              <w:fldChar w:fldCharType="end"/>
+            </w:r>
+          </w:hyperlink>
+        </w:p>
+        <w:p>
+          <w:pPr>
+            <w:pStyle w:val="TOC1"/>
+            <w:tabs>
+              <w:tab w:val="right" w:leader="dot" w:pos="9016"/>
+            </w:tabs>
+            <w:rPr>
+              <w:rFonts w:eastAsiaTheme="minorEastAsia"/>
+              <w:noProof/>
+              <w:lang/>
+            </w:rPr>
+          </w:pPr>
+          <w:hyperlink w:anchor="_Toc231916337" w:history="1">
+            <w:r>
+              <w:rPr>
+                <w:rStyle w:val="Hyperlink"/>
+                <w:noProof/>
                 <w:lang w:val="en-US"/>
               </w:rPr>
               <w:t>Process Data</w:t>
@@ -359,7 +758,7 @@
                 <w:noProof/>
                 <w:webHidden/>
               </w:rPr>
-              <w:instrText xml:space="preserve"> PAGEREF _Toc228799185 \h </w:instrText>
+              <w:instrText xml:space="preserve"> PAGEREF _Toc231916337 \h </w:instrText>
             </w:r>
             <w:r>
               <w:rPr>
@@ -379,7 +778,7 @@
                 <w:noProof/>
                 <w:webHidden/>
               </w:rPr>
-              <w:t>1</w:t>
+              <w:t>3</w:t>
             </w:r>
             <w:r>
               <w:rPr>
@@ -416,7 +815,7 @@
           <w:lang w:val="en-US"/>
         </w:rPr>
       </w:pPr>
-      <w:bookmarkStart w:id="0" w:name="_Toc228799182"/>
+      <w:bookmarkStart w:id="0" w:name="_Toc231916329"/>
       <w:r>
         <w:rPr>
           <w:lang w:val="en-US"/>
@@ -427,6 +826,7 @@
     </w:p>
     <w:p>
       <w:pPr>
+        <w:jc w:val="both"/>
         <w:rPr>
           <w:lang w:val="en-US"/>
         </w:rPr>
@@ -435,27 +835,25 @@
         <w:rPr>
           <w:lang w:val="en-US"/>
         </w:rPr>
-        <w:t xml:space="preserve">The </w:t>
-      </w:r>
-      <w:proofErr w:type="spellStart"/>
+        <w:t xml:space="preserve">The MeMRI PTB can be </w:t>
+      </w:r>
       <w:r>
         <w:rPr>
           <w:lang w:val="en-US"/>
         </w:rPr>
-        <w:t>MeMRI</w:t>
-      </w:r>
-      <w:proofErr w:type="spellEnd"/>
+        <w:t>downloaded</w:t>
+      </w:r>
       <w:r>
         <w:rPr>
           <w:lang w:val="en-US"/>
         </w:rPr>
-        <w:t xml:space="preserve"> PTB can be </w:t>
+        <w:t xml:space="preserve"> </w:t>
       </w:r>
       <w:r>
         <w:rPr>
           <w:lang w:val="en-US"/>
         </w:rPr>
-        <w:t>downloaded</w:t>
+        <w:t>from</w:t>
       </w:r>
       <w:r>
         <w:rPr>
@@ -463,20 +861,7 @@
         </w:rPr>
         <w:t xml:space="preserve"> </w:t>
       </w:r>
-      <w:r>
-        <w:rPr>
-          <w:lang w:val="en-US"/>
-        </w:rPr>
-        <w:t>from</w:t>
-      </w:r>
-      <w:r>
-        <w:rPr>
-          <w:lang w:val="en-US"/>
-        </w:rPr>
-        <w:t xml:space="preserve"> </w:t>
-      </w:r>
-      <w:hyperlink r:id="rId7" w:history="1">
-        <w:proofErr w:type="spellStart"/>
+      <w:hyperlink r:id="rId8" w:history="1">
         <w:r>
           <w:rPr>
             <w:rStyle w:val="Hyperlink"/>
@@ -484,7 +869,6 @@
           </w:rPr>
           <w:t>github</w:t>
         </w:r>
-        <w:proofErr w:type="spellEnd"/>
       </w:hyperlink>
       <w:r>
         <w:rPr>
@@ -496,13 +880,13 @@
         <w:rPr>
           <w:lang w:val="en-US"/>
         </w:rPr>
-        <w:t>using</w:t>
+        <w:t>via the MATLAB environment</w:t>
       </w:r>
       <w:r>
         <w:rPr>
           <w:lang w:val="en-US"/>
         </w:rPr>
-        <w:t xml:space="preserve"> git.</w:t>
+        <w:t>.</w:t>
       </w:r>
       <w:r>
         <w:rPr>
@@ -553,7 +937,7 @@
         </w:rPr>
         <w:t xml:space="preserve">Download location: </w:t>
       </w:r>
-      <w:hyperlink r:id="rId8" w:history="1">
+      <w:hyperlink r:id="rId9" w:history="1">
         <w:r>
           <w:rPr>
             <w:rStyle w:val="Hyperlink"/>
@@ -570,21 +954,124 @@
           <w:lang w:val="it-IT"/>
         </w:rPr>
       </w:pPr>
-      <w:bookmarkStart w:id="1" w:name="_Toc228799183"/>
-      <w:proofErr w:type="spellStart"/>
-      <w:r>
-        <w:rPr>
-          <w:lang w:val="it-IT"/>
-        </w:rPr>
-        <w:t>G</w:t>
-      </w:r>
-      <w:r>
-        <w:rPr>
-          <w:lang w:val="it-IT"/>
-        </w:rPr>
-        <w:t>it</w:t>
-      </w:r>
-      <w:proofErr w:type="spellEnd"/>
+      <w:bookmarkStart w:id="1" w:name="_Toc231916330"/>
+      <w:r>
+        <w:rPr>
+          <w:lang w:val="it-IT"/>
+        </w:rPr>
+        <w:t>Github</w:t>
+      </w:r>
+      <w:r>
+        <w:rPr>
+          <w:lang w:val="it-IT"/>
+        </w:rPr>
+        <w:t xml:space="preserve"> in MATLAB</w:t>
+      </w:r>
+      <w:bookmarkEnd w:id="1"/>
+    </w:p>
+    <w:p>
+      <w:pPr>
+        <w:jc w:val="both"/>
+        <w:rPr>
+          <w:lang w:val="it-IT"/>
+        </w:rPr>
+      </w:pPr>
+      <w:r>
+        <w:rPr>
+          <w:lang w:val="it-IT"/>
+        </w:rPr>
+        <w:t>Create an empty folder</w:t>
+      </w:r>
+      <w:r>
+        <w:rPr>
+          <w:lang w:val="it-IT"/>
+        </w:rPr>
+        <w:t xml:space="preserve"> for the MeMRI PTB files using the </w:t>
+      </w:r>
+      <w:r>
+        <w:rPr>
+          <w:lang w:val="it-IT"/>
+        </w:rPr>
+        <w:t>“</w:t>
+      </w:r>
+      <w:r>
+        <w:rPr>
+          <w:lang w:val="it-IT"/>
+        </w:rPr>
+        <w:t>Current Folder</w:t>
+      </w:r>
+      <w:r>
+        <w:rPr>
+          <w:lang w:val="it-IT"/>
+        </w:rPr>
+        <w:t>”</w:t>
+      </w:r>
+      <w:r>
+        <w:rPr>
+          <w:lang w:val="it-IT"/>
+        </w:rPr>
+        <w:t xml:space="preserve"> pane</w:t>
+      </w:r>
+      <w:r>
+        <w:rPr>
+          <w:lang w:val="it-IT"/>
+        </w:rPr>
+        <w:t xml:space="preserve"> via right-click &gt; New &gt; Folder</w:t>
+      </w:r>
+      <w:r>
+        <w:rPr>
+          <w:lang w:val="it-IT"/>
+        </w:rPr>
+        <w:t xml:space="preserve">. </w:t>
+      </w:r>
+      <w:r>
+        <w:rPr>
+          <w:lang w:val="it-IT"/>
+        </w:rPr>
+        <w:t>Open the directory</w:t>
+      </w:r>
+      <w:r>
+        <w:rPr>
+          <w:lang w:val="it-IT"/>
+        </w:rPr>
+        <w:t xml:space="preserve">, </w:t>
+      </w:r>
+      <w:r>
+        <w:rPr>
+          <w:lang w:val="it-IT"/>
+        </w:rPr>
+        <w:t>after renaming it to your liking</w:t>
+      </w:r>
+      <w:r>
+        <w:rPr>
+          <w:lang w:val="it-IT"/>
+        </w:rPr>
+        <w:t>,</w:t>
+      </w:r>
+      <w:r>
+        <w:rPr>
+          <w:lang w:val="it-IT"/>
+        </w:rPr>
+        <w:t xml:space="preserve"> right-click in</w:t>
+      </w:r>
+      <w:r>
+        <w:rPr>
+          <w:lang w:val="it-IT"/>
+        </w:rPr>
+        <w:t>side</w:t>
+      </w:r>
+      <w:r>
+        <w:rPr>
+          <w:lang w:val="it-IT"/>
+        </w:rPr>
+        <w:t xml:space="preserve"> the white space</w:t>
+      </w:r>
+      <w:r>
+        <w:rPr>
+          <w:lang w:val="it-IT"/>
+        </w:rPr>
+        <w:t xml:space="preserve"> and select</w:t>
+      </w:r>
       <w:r>
         <w:rPr>
           <w:lang w:val="it-IT"/>
@@ -595,7 +1082,25 @@
         <w:rPr>
           <w:lang w:val="it-IT"/>
         </w:rPr>
-        <w:t>and</w:t>
+        <w:t>“Source Control”.</w:t>
+      </w:r>
+      <w:r>
+        <w:rPr>
+          <w:lang w:val="it-IT"/>
+        </w:rPr>
+        <w:t xml:space="preserve"> The </w:t>
+      </w:r>
+      <w:r>
+        <w:rPr>
+          <w:lang w:val="it-IT"/>
+        </w:rPr>
+        <w:t>window</w:t>
+      </w:r>
+      <w:r>
+        <w:rPr>
+          <w:lang w:val="it-IT"/>
+        </w:rPr>
+        <w:t xml:space="preserve"> below</w:t>
       </w:r>
       <w:r>
         <w:rPr>
@@ -603,22 +1108,114 @@
         </w:rPr>
         <w:t xml:space="preserve"> </w:t>
       </w:r>
-      <w:proofErr w:type="spellStart"/>
-      <w:r>
-        <w:rPr>
-          <w:lang w:val="it-IT"/>
-        </w:rPr>
-        <w:t>Github</w:t>
-      </w:r>
-      <w:bookmarkEnd w:id="1"/>
-      <w:proofErr w:type="spellEnd"/>
-    </w:p>
-    <w:p>
-      <w:pPr>
-        <w:rPr>
-          <w:lang w:val="it-IT"/>
-        </w:rPr>
-      </w:pPr>
+      <w:r>
+        <w:rPr>
+          <w:lang w:val="it-IT"/>
+        </w:rPr>
+        <w:t>will</w:t>
+      </w:r>
+      <w:r>
+        <w:rPr>
+          <w:lang w:val="it-IT"/>
+        </w:rPr>
+        <w:t xml:space="preserve"> appear:</w:t>
+      </w:r>
+    </w:p>
+    <w:p>
+      <w:pPr>
+        <w:jc w:val="center"/>
+        <w:rPr>
+          <w:lang w:val="it-IT"/>
+        </w:rPr>
+      </w:pPr>
+      <w:r>
+        <w:rPr>
+          <w:noProof/>
+        </w:rPr>
+        <w:lastRenderedPageBreak/>
+        <w:drawing>
+          <wp:inline distT="0" distB="0" distL="0" distR="0" wp14:anchorId="7DDD146A" wp14:editId="126FB050">
+            <wp:extent cx="4529247" cy="2279177"/>
+            <wp:effectExtent l="0" t="0" r="5080" b="6985"/>
+            <wp:docPr id="191126523" name="Picture 1"/>
+            <wp:cNvGraphicFramePr>
+              <a:graphicFrameLocks xmlns:a="http://schemas.openxmlformats.org/drawingml/2006/main" noChangeAspect="1"/>
+            </wp:cNvGraphicFramePr>
+            <a:graphic xmlns:a="http://schemas.openxmlformats.org/drawingml/2006/main">
+              <a:graphicData uri="http://schemas.openxmlformats.org/drawingml/2006/picture">
+                <pic:pic xmlns:pic="http://schemas.openxmlformats.org/drawingml/2006/picture">
+                  <pic:nvPicPr>
+                    <pic:cNvPr id="191126523" name=""/>
+                    <pic:cNvPicPr/>
+                  </pic:nvPicPr>
+                  <pic:blipFill>
+                    <a:blip r:embed="rId10"/>
+                    <a:stretch>
+                      <a:fillRect/>
+                    </a:stretch>
+                  </pic:blipFill>
+                  <pic:spPr>
+                    <a:xfrm>
+                      <a:off x="0" y="0"/>
+                      <a:ext cx="4549448" cy="2289342"/>
+                    </a:xfrm>
+                    <a:prstGeom prst="rect">
+                      <a:avLst/>
+                    </a:prstGeom>
+                  </pic:spPr>
+                </pic:pic>
+              </a:graphicData>
+            </a:graphic>
+          </wp:inline>
+        </w:drawing>
+      </w:r>
+    </w:p>
+    <w:p>
+      <w:pPr>
+        <w:jc w:val="both"/>
+        <w:rPr>
+          <w:lang w:val="it-IT"/>
+        </w:rPr>
+      </w:pPr>
+      <w:r>
+        <w:rPr>
+          <w:lang w:val="it-IT"/>
+        </w:rPr>
+        <w:t>Select Git as “Source Control Integration” and enter the github path</w:t>
+      </w:r>
+      <w:r>
+        <w:rPr>
+          <w:lang w:val="it-IT"/>
+        </w:rPr>
+        <w:t xml:space="preserve"> (</w:t>
+      </w:r>
+      <w:hyperlink r:id="rId11" w:history="1">
+        <w:r>
+          <w:rPr>
+            <w:rStyle w:val="Hyperlink"/>
+            <w:lang w:val="en-US"/>
+          </w:rPr>
+          <w:t>https://github.com/Illuminate-MeMRI/Metabolic-MRI-Toolbox</w:t>
+        </w:r>
+      </w:hyperlink>
+      <w:r>
+        <w:rPr>
+          <w:lang w:val="en-GB"/>
+        </w:rPr>
+        <w:t>)</w:t>
+      </w:r>
+      <w:r>
+        <w:rPr>
+          <w:lang w:val="it-IT"/>
+        </w:rPr>
+        <w:t xml:space="preserve"> in the “Repository path” edit bar.</w:t>
+      </w:r>
+      <w:r>
+        <w:rPr>
+          <w:lang w:val="it-IT"/>
+        </w:rPr>
+        <w:t xml:space="preserve"> Click “retrieve” at the bottom right and wait until MATLAB has downloaded the required files.</w:t>
+      </w:r>
     </w:p>
     <w:p>
       <w:pPr>
@@ -627,33 +1224,1157 @@
           <w:lang w:val="it-IT"/>
         </w:rPr>
       </w:pPr>
-      <w:bookmarkStart w:id="2" w:name="_Toc228799184"/>
-      <w:r>
-        <w:rPr>
-          <w:lang w:val="it-IT"/>
-        </w:rPr>
-        <w:t>Load Data</w:t>
+      <w:bookmarkStart w:id="2" w:name="_Toc231916331"/>
+      <w:r>
+        <w:rPr>
+          <w:lang w:val="it-IT"/>
+        </w:rPr>
+        <w:t>Framework</w:t>
+      </w:r>
+      <w:r>
+        <w:rPr>
+          <w:lang w:val="it-IT"/>
+        </w:rPr>
+        <w:t xml:space="preserve"> Explained</w:t>
       </w:r>
       <w:bookmarkEnd w:id="2"/>
+      <w:r>
+        <w:rPr>
+          <w:lang w:val="it-IT"/>
+        </w:rPr>
+        <w:t xml:space="preserve"> </w:t>
+      </w:r>
+    </w:p>
+    <w:p>
+      <w:pPr>
+        <w:rPr>
+          <w:lang w:val="it-IT"/>
+        </w:rPr>
+      </w:pPr>
+      <w:r>
+        <w:rPr>
+          <w:lang w:val="it-IT"/>
+        </w:rPr>
+        <w:t>&lt;</w:t>
+      </w:r>
+      <w:r>
+        <w:rPr>
+          <w:lang w:val="it-IT"/>
+        </w:rPr>
+        <w:t>This needs to be moved to main help file</w:t>
+      </w:r>
+      <w:r>
+        <w:rPr>
+          <w:lang w:val="it-IT"/>
+        </w:rPr>
+        <w:t>&gt;</w:t>
+      </w:r>
+    </w:p>
+    <w:p>
+      <w:pPr>
+        <w:jc w:val="both"/>
+        <w:rPr>
+          <w:lang w:val="it-IT"/>
+        </w:rPr>
+      </w:pPr>
+      <w:r>
+        <w:rPr>
+          <w:lang w:val="it-IT"/>
+        </w:rPr>
+        <w:t xml:space="preserve">The MeMRI PTB </w:t>
+      </w:r>
+      <w:r>
+        <w:rPr>
+          <w:lang w:val="it-IT"/>
+        </w:rPr>
+        <w:t xml:space="preserve">can be executed </w:t>
+      </w:r>
+      <w:r>
+        <w:rPr>
+          <w:lang w:val="it-IT"/>
+        </w:rPr>
+        <w:t xml:space="preserve">using </w:t>
+      </w:r>
+      <w:r>
+        <w:rPr>
+          <w:lang w:val="it-IT"/>
+        </w:rPr>
+        <w:t xml:space="preserve">solely scripts or </w:t>
+      </w:r>
+      <w:r>
+        <w:rPr>
+          <w:lang w:val="it-IT"/>
+        </w:rPr>
+        <w:t>via</w:t>
+      </w:r>
+      <w:r>
+        <w:rPr>
+          <w:lang w:val="it-IT"/>
+        </w:rPr>
+        <w:t xml:space="preserve"> a graphical user interface</w:t>
+      </w:r>
+      <w:r>
+        <w:rPr>
+          <w:lang w:val="it-IT"/>
+        </w:rPr>
+        <w:t xml:space="preserve"> (GUI) and it</w:t>
+      </w:r>
+      <w:r>
+        <w:rPr>
+          <w:lang w:val="it-IT"/>
+        </w:rPr>
+        <w:t xml:space="preserve"> </w:t>
+      </w:r>
+      <w:r>
+        <w:rPr>
+          <w:lang w:val="it-IT"/>
+        </w:rPr>
+        <w:t>combines</w:t>
+      </w:r>
+      <w:r>
+        <w:rPr>
+          <w:lang w:val="it-IT"/>
+        </w:rPr>
+        <w:t xml:space="preserve"> </w:t>
+      </w:r>
+      <w:r>
+        <w:rPr>
+          <w:lang w:val="it-IT"/>
+        </w:rPr>
+        <w:t>four</w:t>
+      </w:r>
+      <w:r>
+        <w:rPr>
+          <w:lang w:val="it-IT"/>
+        </w:rPr>
+        <w:t xml:space="preserve"> </w:t>
+      </w:r>
+      <w:r>
+        <w:rPr>
+          <w:lang w:val="it-IT"/>
+        </w:rPr>
+        <w:t>functions into one package</w:t>
+      </w:r>
+      <w:r>
+        <w:rPr>
+          <w:lang w:val="it-IT"/>
+        </w:rPr>
+        <w:t xml:space="preserve">: </w:t>
+      </w:r>
+    </w:p>
+    <w:p>
+      <w:pPr>
+        <w:pStyle w:val="ListParagraph"/>
+        <w:numPr>
+          <w:ilvl w:val="0"/>
+          <w:numId w:val="1"/>
+        </w:numPr>
+        <w:jc w:val="both"/>
+        <w:rPr>
+          <w:lang w:val="it-IT"/>
+        </w:rPr>
+      </w:pPr>
+      <w:r>
+        <w:rPr>
+          <w:lang w:val="it-IT"/>
+        </w:rPr>
+        <w:t>Converting d</w:t>
+      </w:r>
+      <w:r>
+        <w:rPr>
+          <w:lang w:val="it-IT"/>
+        </w:rPr>
+        <w:t>ata</w:t>
+      </w:r>
+    </w:p>
+    <w:p>
+      <w:pPr>
+        <w:pStyle w:val="ListParagraph"/>
+        <w:numPr>
+          <w:ilvl w:val="0"/>
+          <w:numId w:val="1"/>
+        </w:numPr>
+        <w:jc w:val="both"/>
+        <w:rPr>
+          <w:lang w:val="it-IT"/>
+        </w:rPr>
+      </w:pPr>
+      <w:r>
+        <w:rPr>
+          <w:lang w:val="it-IT"/>
+        </w:rPr>
+        <w:t>Processing</w:t>
+      </w:r>
+    </w:p>
+    <w:p>
+      <w:pPr>
+        <w:pStyle w:val="ListParagraph"/>
+        <w:numPr>
+          <w:ilvl w:val="0"/>
+          <w:numId w:val="1"/>
+        </w:numPr>
+        <w:jc w:val="both"/>
+        <w:rPr>
+          <w:lang w:val="it-IT"/>
+        </w:rPr>
+      </w:pPr>
+      <w:r>
+        <w:rPr>
+          <w:lang w:val="it-IT"/>
+        </w:rPr>
+        <w:t>Visualization</w:t>
+      </w:r>
+    </w:p>
+    <w:p>
+      <w:pPr>
+        <w:pStyle w:val="ListParagraph"/>
+        <w:numPr>
+          <w:ilvl w:val="0"/>
+          <w:numId w:val="1"/>
+        </w:numPr>
+        <w:jc w:val="both"/>
+        <w:rPr>
+          <w:lang w:val="it-IT"/>
+        </w:rPr>
+      </w:pPr>
+      <w:r>
+        <w:rPr>
+          <w:lang w:val="it-IT"/>
+        </w:rPr>
+        <w:t>Quantification</w:t>
+      </w:r>
+    </w:p>
+    <w:p>
+      <w:pPr>
+        <w:jc w:val="both"/>
+        <w:rPr>
+          <w:lang w:val="it-IT"/>
+        </w:rPr>
+      </w:pPr>
+      <w:r>
+        <w:rPr>
+          <w:lang w:val="it-IT"/>
+        </w:rPr>
+        <w:t>The script</w:t>
+      </w:r>
+      <w:r>
+        <w:rPr>
+          <w:lang w:val="it-IT"/>
+        </w:rPr>
+        <w:t>-</w:t>
+      </w:r>
+      <w:r>
+        <w:rPr>
+          <w:lang w:val="it-IT"/>
+        </w:rPr>
+        <w:t>of</w:t>
+      </w:r>
+      <w:r>
+        <w:rPr>
+          <w:lang w:val="it-IT"/>
+        </w:rPr>
+        <w:t>-</w:t>
+      </w:r>
+      <w:r>
+        <w:rPr>
+          <w:lang w:val="it-IT"/>
+        </w:rPr>
+        <w:t xml:space="preserve">interest </w:t>
+      </w:r>
+      <w:r>
+        <w:rPr>
+          <w:lang w:val="it-IT"/>
+        </w:rPr>
+        <w:t xml:space="preserve">for </w:t>
+      </w:r>
+      <w:r>
+        <w:rPr>
+          <w:u w:val="single"/>
+          <w:lang w:val="it-IT"/>
+        </w:rPr>
+        <w:t>each</w:t>
+      </w:r>
+      <w:r>
+        <w:rPr>
+          <w:u w:val="single"/>
+          <w:lang w:val="it-IT"/>
+        </w:rPr>
+        <w:t xml:space="preserve"> function</w:t>
+      </w:r>
+      <w:r>
+        <w:rPr>
+          <w:lang w:val="it-IT"/>
+        </w:rPr>
+        <w:t xml:space="preserve">, </w:t>
+      </w:r>
+      <w:r>
+        <w:rPr>
+          <w:u w:val="single"/>
+          <w:lang w:val="it-IT"/>
+        </w:rPr>
+        <w:t>hard requirements</w:t>
+      </w:r>
+      <w:r>
+        <w:rPr>
+          <w:lang w:val="it-IT"/>
+        </w:rPr>
+        <w:t xml:space="preserve"> </w:t>
+      </w:r>
+      <w:r>
+        <w:rPr>
+          <w:lang w:val="it-IT"/>
+        </w:rPr>
+        <w:t>plus</w:t>
+      </w:r>
+      <w:r>
+        <w:rPr>
+          <w:lang w:val="it-IT"/>
+        </w:rPr>
+        <w:t xml:space="preserve"> a </w:t>
+      </w:r>
+      <w:r>
+        <w:rPr>
+          <w:u w:val="single"/>
+          <w:lang w:val="it-IT"/>
+        </w:rPr>
+        <w:t>short description</w:t>
+      </w:r>
+      <w:r>
+        <w:rPr>
+          <w:lang w:val="it-IT"/>
+        </w:rPr>
+        <w:t xml:space="preserve"> is given in the next paragraphs.</w:t>
+      </w:r>
+      <w:r>
+        <w:rPr>
+          <w:lang w:val="it-IT"/>
+        </w:rPr>
+        <w:t xml:space="preserve"> </w:t>
+      </w:r>
+      <w:r>
+        <w:rPr>
+          <w:lang w:val="it-IT"/>
+        </w:rPr>
+        <w:t>All scripts-of-interest are found in the root-folder of MeMRI PTB.</w:t>
+      </w:r>
+      <w:r>
+        <w:rPr>
+          <w:lang w:val="it-IT"/>
+        </w:rPr>
+        <w:t xml:space="preserve"> All </w:t>
+      </w:r>
+    </w:p>
+    <w:p>
+      <w:pPr>
+        <w:pStyle w:val="Heading3"/>
+        <w:rPr>
+          <w:lang w:val="it-IT"/>
+        </w:rPr>
+      </w:pPr>
+      <w:bookmarkStart w:id="3" w:name="_Toc231916332"/>
+      <w:r>
+        <w:rPr>
+          <w:lang w:val="it-IT"/>
+        </w:rPr>
+        <w:t>Reading</w:t>
+      </w:r>
+      <w:r>
+        <w:rPr>
+          <w:lang w:val="it-IT"/>
+        </w:rPr>
+        <w:t xml:space="preserve"> </w:t>
+      </w:r>
+      <w:r>
+        <w:rPr>
+          <w:lang w:val="it-IT"/>
+        </w:rPr>
+        <w:t>raw data</w:t>
+      </w:r>
+      <w:bookmarkEnd w:id="3"/>
+    </w:p>
+    <w:p>
+      <w:pPr>
+        <w:spacing w:after="0"/>
+        <w:rPr>
+          <w:lang w:val="it-IT"/>
+        </w:rPr>
+      </w:pPr>
+      <w:r>
+        <w:rPr>
+          <w:lang w:val="it-IT"/>
+        </w:rPr>
+        <w:t>Script</w:t>
+      </w:r>
+      <w:r>
+        <w:rPr>
+          <w:lang w:val="it-IT"/>
+        </w:rPr>
+        <w:t>(s)</w:t>
+      </w:r>
+      <w:r>
+        <w:rPr>
+          <w:lang w:val="it-IT"/>
+        </w:rPr>
+        <w:t xml:space="preserve"> of interest: </w:t>
+      </w:r>
+      <w:r>
+        <w:rPr>
+          <w:lang w:val="it-IT"/>
+        </w:rPr>
+        <w:tab/>
+      </w:r>
+      <w:r>
+        <w:rPr>
+          <w:i/>
+          <w:iCs/>
+          <w:lang w:val="it-IT"/>
+        </w:rPr>
+        <w:t>memri_DataConverter_Scripted</w:t>
+      </w:r>
+      <w:r>
+        <w:rPr>
+          <w:lang w:val="it-IT"/>
+        </w:rPr>
+        <w:t xml:space="preserve">.m </w:t>
+      </w:r>
+    </w:p>
+    <w:p>
+      <w:pPr>
+        <w:ind w:left="1440" w:firstLine="720"/>
+        <w:rPr>
+          <w:i/>
+          <w:iCs/>
+          <w:lang w:val="it-IT"/>
+        </w:rPr>
+      </w:pPr>
+      <w:r>
+        <w:rPr>
+          <w:i/>
+          <w:iCs/>
+          <w:lang w:val="it-IT"/>
+        </w:rPr>
+        <w:t>memri_DataConverter_</w:t>
+      </w:r>
+      <w:r>
+        <w:rPr>
+          <w:i/>
+          <w:iCs/>
+          <w:lang w:val="it-IT"/>
+        </w:rPr>
+        <w:t>GUI</w:t>
+      </w:r>
+      <w:r>
+        <w:rPr>
+          <w:i/>
+          <w:iCs/>
+          <w:lang w:val="it-IT"/>
+        </w:rPr>
+        <w:t>.m</w:t>
+      </w:r>
+    </w:p>
+    <w:p>
+      <w:pPr>
+        <w:rPr>
+          <w:lang w:val="it-IT"/>
+        </w:rPr>
+      </w:pPr>
+      <w:r>
+        <w:rPr>
+          <w:lang w:val="it-IT"/>
+        </w:rPr>
+        <w:t>Convert the raw data into a MATLAB format that includes all necessary parameters to process the spectroscopy data.</w:t>
+      </w:r>
+    </w:p>
+    <w:p>
+      <w:pPr>
+        <w:rPr>
+          <w:lang w:val="it-IT"/>
+        </w:rPr>
+      </w:pPr>
+      <w:r>
+        <w:rPr>
+          <w:lang w:val="it-IT"/>
+        </w:rPr>
+        <w:t xml:space="preserve">Philips exports raw MR spectroscopy data </w:t>
+      </w:r>
+      <w:r>
+        <w:rPr>
+          <w:lang w:val="it-IT"/>
+        </w:rPr>
+        <w:t>in</w:t>
+      </w:r>
+      <w:r>
+        <w:rPr>
+          <w:lang w:val="it-IT"/>
+        </w:rPr>
+        <w:t xml:space="preserve"> a list- &amp; data- file format</w:t>
+      </w:r>
+      <w:r>
+        <w:rPr>
+          <w:lang w:val="it-IT"/>
+        </w:rPr>
+        <w:t xml:space="preserve">, but lacks and protocol information or parameters. </w:t>
+      </w:r>
+      <w:r>
+        <w:rPr>
+          <w:lang w:val="it-IT"/>
+        </w:rPr>
+        <w:t xml:space="preserve">and </w:t>
+      </w:r>
+      <w:r>
+        <w:rPr>
+          <w:lang w:val="it-IT"/>
+        </w:rPr>
+        <w:t>Siemens exports it in a dat-file format.</w:t>
+      </w:r>
+      <w:r>
+        <w:rPr>
+          <w:lang w:val="it-IT"/>
+        </w:rPr>
+        <w:t xml:space="preserve"> </w:t>
+      </w:r>
+    </w:p>
+    <w:p>
+      <w:pPr>
+        <w:rPr>
+          <w:lang w:val="it-IT"/>
+        </w:rPr>
+      </w:pPr>
+      <w:r>
+        <w:rPr>
+          <w:lang w:val="it-IT"/>
+        </w:rPr>
+        <w:t xml:space="preserve"> The</w:t>
+      </w:r>
+      <w:r>
+        <w:rPr>
+          <w:lang w:val="it-IT"/>
+        </w:rPr>
+        <w:t xml:space="preserve"> script or GUI load both data sets into MATLAB memory and export is appropriately.,  </w:t>
+      </w:r>
+    </w:p>
+    <w:p>
+      <w:pPr>
+        <w:pStyle w:val="Heading3"/>
+        <w:rPr>
+          <w:lang w:val="it-IT"/>
+        </w:rPr>
+      </w:pPr>
+      <w:bookmarkStart w:id="4" w:name="_Toc231916333"/>
+      <w:r>
+        <w:rPr>
+          <w:lang w:val="it-IT"/>
+        </w:rPr>
+        <w:lastRenderedPageBreak/>
+        <w:t>Processing</w:t>
+      </w:r>
+      <w:bookmarkEnd w:id="4"/>
+    </w:p>
+    <w:p>
+      <w:pPr>
+        <w:spacing w:after="0"/>
+        <w:rPr>
+          <w:lang w:val="it-IT"/>
+        </w:rPr>
+      </w:pPr>
+      <w:r>
+        <w:rPr>
+          <w:lang w:val="it-IT"/>
+        </w:rPr>
+        <w:t xml:space="preserve">Script(s) of interest: </w:t>
+      </w:r>
+      <w:r>
+        <w:rPr>
+          <w:lang w:val="it-IT"/>
+        </w:rPr>
+        <w:tab/>
+      </w:r>
+      <w:r>
+        <w:rPr>
+          <w:i/>
+          <w:iCs/>
+          <w:lang w:val="it-IT"/>
+        </w:rPr>
+        <w:t>memri_</w:t>
+      </w:r>
+      <w:r>
+        <w:rPr>
+          <w:i/>
+          <w:iCs/>
+          <w:lang w:val="it-IT"/>
+        </w:rPr>
+        <w:t>Processing</w:t>
+      </w:r>
+      <w:r>
+        <w:rPr>
+          <w:i/>
+          <w:iCs/>
+          <w:lang w:val="it-IT"/>
+        </w:rPr>
+        <w:t>_Scripted</w:t>
+      </w:r>
+      <w:r>
+        <w:rPr>
+          <w:lang w:val="it-IT"/>
+        </w:rPr>
+        <w:t xml:space="preserve">.m </w:t>
+      </w:r>
+    </w:p>
+    <w:p>
+      <w:pPr>
+        <w:ind w:left="1440" w:firstLine="720"/>
+        <w:rPr>
+          <w:i/>
+          <w:iCs/>
+          <w:lang w:val="it-IT"/>
+        </w:rPr>
+      </w:pPr>
+      <w:r>
+        <w:rPr>
+          <w:i/>
+          <w:iCs/>
+          <w:lang w:val="it-IT"/>
+        </w:rPr>
+        <w:t>memri_</w:t>
+      </w:r>
+      <w:r>
+        <w:rPr>
+          <w:i/>
+          <w:iCs/>
+          <w:lang w:val="it-IT"/>
+        </w:rPr>
+        <w:t>Processing</w:t>
+      </w:r>
+      <w:r>
+        <w:rPr>
+          <w:i/>
+          <w:iCs/>
+          <w:lang w:val="it-IT"/>
+        </w:rPr>
+        <w:t>_GUI</w:t>
+      </w:r>
+      <w:r>
+        <w:rPr>
+          <w:i/>
+          <w:iCs/>
+          <w:lang w:val="it-IT"/>
+        </w:rPr>
+        <w:t>.m</w:t>
+      </w:r>
+    </w:p>
+    <w:p>
+      <w:pPr>
+        <w:rPr>
+          <w:lang w:val="it-IT"/>
+        </w:rPr>
+      </w:pPr>
+    </w:p>
+    <w:p>
+      <w:pPr>
+        <w:pStyle w:val="Heading3"/>
+        <w:rPr>
+          <w:lang w:val="it-IT"/>
+        </w:rPr>
+      </w:pPr>
+      <w:bookmarkStart w:id="5" w:name="_Toc231916334"/>
+      <w:r>
+        <w:rPr>
+          <w:lang w:val="it-IT"/>
+        </w:rPr>
+        <w:t>Visualization</w:t>
+      </w:r>
+      <w:bookmarkEnd w:id="5"/>
+    </w:p>
+    <w:p>
+      <w:pPr>
+        <w:rPr>
+          <w:i/>
+          <w:iCs/>
+          <w:lang w:val="it-IT"/>
+        </w:rPr>
+      </w:pPr>
+      <w:r>
+        <w:rPr>
+          <w:lang w:val="it-IT"/>
+        </w:rPr>
+        <w:t xml:space="preserve">Script(s) of interest: </w:t>
+      </w:r>
+      <w:r>
+        <w:rPr>
+          <w:i/>
+          <w:iCs/>
+          <w:lang w:val="it-IT"/>
+        </w:rPr>
+        <w:t>CSIgui.m</w:t>
+      </w:r>
+    </w:p>
+    <w:p>
+      <w:pPr>
+        <w:rPr>
+          <w:lang w:val="it-IT"/>
+        </w:rPr>
+      </w:pPr>
+      <w:r>
+        <w:rPr>
+          <w:lang w:val="it-IT"/>
+        </w:rPr>
+        <w:t>A new light-weight viewing tool will be written in the very near future.</w:t>
+      </w:r>
+    </w:p>
+    <w:p>
+      <w:pPr>
+        <w:pStyle w:val="Heading3"/>
+        <w:rPr>
+          <w:lang w:val="it-IT"/>
+        </w:rPr>
+      </w:pPr>
+      <w:bookmarkStart w:id="6" w:name="_Toc231916335"/>
+      <w:r>
+        <w:rPr>
+          <w:lang w:val="it-IT"/>
+        </w:rPr>
+        <w:t>Quantification</w:t>
+      </w:r>
+      <w:bookmarkEnd w:id="6"/>
+    </w:p>
+    <w:p>
+      <w:pPr>
+        <w:spacing w:after="0"/>
+        <w:rPr>
+          <w:lang w:val="it-IT"/>
+        </w:rPr>
+      </w:pPr>
+      <w:r>
+        <w:rPr>
+          <w:lang w:val="it-IT"/>
+        </w:rPr>
+        <w:t xml:space="preserve">Script(s) of interest: </w:t>
+      </w:r>
+      <w:r>
+        <w:rPr>
+          <w:lang w:val="it-IT"/>
+        </w:rPr>
+        <w:tab/>
+      </w:r>
+      <w:r>
+        <w:rPr>
+          <w:i/>
+          <w:iCs/>
+          <w:lang w:val="it-IT"/>
+        </w:rPr>
+        <w:t>memri_</w:t>
+      </w:r>
+      <w:r>
+        <w:rPr>
+          <w:i/>
+          <w:iCs/>
+          <w:lang w:val="it-IT"/>
+        </w:rPr>
+        <w:t>Quantification_GUI</w:t>
+      </w:r>
+      <w:r>
+        <w:rPr>
+          <w:lang w:val="it-IT"/>
+        </w:rPr>
+        <w:t xml:space="preserve">.m </w:t>
+      </w:r>
+    </w:p>
+    <w:p>
+      <w:pPr>
+        <w:ind w:left="1440" w:firstLine="720"/>
+        <w:rPr>
+          <w:i/>
+          <w:iCs/>
+          <w:lang w:val="it-IT"/>
+        </w:rPr>
+      </w:pPr>
+      <w:r>
+        <w:rPr>
+          <w:i/>
+          <w:iCs/>
+          <w:lang w:val="it-IT"/>
+        </w:rPr>
+        <w:t>memri_</w:t>
+      </w:r>
+      <w:r>
+        <w:rPr>
+          <w:i/>
+          <w:iCs/>
+          <w:lang w:val="it-IT"/>
+        </w:rPr>
+        <w:t>Quantification_Scripted</w:t>
+      </w:r>
+      <w:r>
+        <w:rPr>
+          <w:i/>
+          <w:iCs/>
+          <w:lang w:val="it-IT"/>
+        </w:rPr>
+        <w:t>.m</w:t>
+      </w:r>
+    </w:p>
+    <w:p>
+      <w:pPr>
+        <w:rPr>
+          <w:lang w:val="it-IT"/>
+        </w:rPr>
+      </w:pPr>
+      <w:r>
+        <w:rPr>
+          <w:lang w:val="it-IT"/>
+        </w:rPr>
+        <w:t>A customized version of OXSA.</w:t>
+      </w:r>
     </w:p>
     <w:p>
       <w:pPr>
         <w:pStyle w:val="Heading1"/>
         <w:rPr>
+          <w:lang w:val="it-IT"/>
+        </w:rPr>
+      </w:pPr>
+      <w:bookmarkStart w:id="7" w:name="_Toc231916336"/>
+      <w:r>
+        <w:rPr>
+          <w:lang w:val="it-IT"/>
+        </w:rPr>
+        <w:t>Data Converter</w:t>
+      </w:r>
+      <w:r>
+        <w:rPr>
+          <w:lang w:val="it-IT"/>
+        </w:rPr>
+        <w:t xml:space="preserve"> (</w:t>
+      </w:r>
+      <w:r>
+        <w:rPr>
+          <w:lang w:val="it-IT"/>
+        </w:rPr>
+        <w:t>Load</w:t>
+      </w:r>
+      <w:r>
+        <w:rPr>
+          <w:lang w:val="it-IT"/>
+        </w:rPr>
+        <w:t>)</w:t>
+      </w:r>
+      <w:bookmarkEnd w:id="7"/>
+    </w:p>
+    <w:p>
+      <w:pPr>
+        <w:jc w:val="both"/>
+        <w:rPr>
+          <w:lang w:val="it-IT"/>
+        </w:rPr>
+      </w:pPr>
+      <w:r>
+        <w:rPr>
+          <w:lang w:val="it-IT"/>
+        </w:rPr>
+        <w:t xml:space="preserve">Data can be loaded using either </w:t>
+      </w:r>
+      <w:r>
+        <w:rPr>
+          <w:lang w:val="it-IT"/>
+        </w:rPr>
+        <w:t xml:space="preserve">the MeMRI </w:t>
+      </w:r>
+      <w:r>
+        <w:rPr>
+          <w:lang w:val="it-IT"/>
+        </w:rPr>
+        <w:t>DataConverter</w:t>
+      </w:r>
+      <w:r>
+        <w:rPr>
+          <w:lang w:val="it-IT"/>
+        </w:rPr>
+        <w:t xml:space="preserve"> </w:t>
+      </w:r>
+      <w:r>
+        <w:rPr>
+          <w:lang w:val="it-IT"/>
+        </w:rPr>
+        <w:t>GUI or Scr</w:t>
+      </w:r>
+      <w:r>
+        <w:rPr>
+          <w:lang w:val="it-IT"/>
+        </w:rPr>
+        <w:t>i</w:t>
+      </w:r>
+      <w:r>
+        <w:rPr>
+          <w:lang w:val="it-IT"/>
+        </w:rPr>
+        <w:t>p</w:t>
+      </w:r>
+      <w:r>
+        <w:rPr>
+          <w:lang w:val="it-IT"/>
+        </w:rPr>
+        <w:t>t</w:t>
+      </w:r>
+      <w:r>
+        <w:rPr>
+          <w:lang w:val="it-IT"/>
+        </w:rPr>
+        <w:t>ed</w:t>
+      </w:r>
+      <w:r>
+        <w:rPr>
+          <w:lang w:val="it-IT"/>
+        </w:rPr>
+        <w:t xml:space="preserve"> version</w:t>
+      </w:r>
+      <w:r>
+        <w:rPr>
+          <w:lang w:val="it-IT"/>
+        </w:rPr>
+        <w:t>. Both use the same underlaying</w:t>
+      </w:r>
+      <w:r>
+        <w:rPr>
+          <w:lang w:val="it-IT"/>
+        </w:rPr>
+        <w:t xml:space="preserve"> function</w:t>
+      </w:r>
+      <w:r>
+        <w:rPr>
+          <w:lang w:val="it-IT"/>
+        </w:rPr>
+        <w:t xml:space="preserve">s to read and convert the raw data to a MATLAB friendly </w:t>
+      </w:r>
+      <w:r>
+        <w:rPr>
+          <w:lang w:val="it-IT"/>
+        </w:rPr>
+        <w:t>format</w:t>
+      </w:r>
+      <w:r>
+        <w:rPr>
+          <w:lang w:val="it-IT"/>
+        </w:rPr>
+        <w:t>.</w:t>
+      </w:r>
+      <w:r>
+        <w:rPr>
+          <w:lang w:val="it-IT"/>
+        </w:rPr>
+        <w:t xml:space="preserve"> Exported data is stored in a struct containing the data</w:t>
+      </w:r>
+    </w:p>
+    <w:p>
+      <w:pPr>
+        <w:pStyle w:val="Heading3"/>
+        <w:rPr>
+          <w:lang w:val="it-IT"/>
+        </w:rPr>
+      </w:pPr>
+      <w:r>
+        <w:rPr>
+          <w:lang w:val="it-IT"/>
+        </w:rPr>
+        <w:t>Philips</w:t>
+      </w:r>
+    </w:p>
+    <w:p>
+      <w:pPr>
+        <w:jc w:val="both"/>
+        <w:rPr>
+          <w:lang w:val="it-IT"/>
+        </w:rPr>
+      </w:pPr>
+      <w:r>
+        <w:rPr>
+          <w:lang w:val="it-IT"/>
+        </w:rPr>
+        <w:t xml:space="preserve">Raw data from Philips platforms </w:t>
+      </w:r>
+      <w:r>
+        <w:rPr>
+          <w:lang w:val="it-IT"/>
+        </w:rPr>
+        <w:t>exported as list/data files is supported</w:t>
+      </w:r>
+      <w:r>
+        <w:rPr>
+          <w:lang w:val="it-IT"/>
+        </w:rPr>
+        <w:t xml:space="preserve"> in combination with a text-file export of protocol information.</w:t>
+      </w:r>
+      <w:r>
+        <w:rPr>
+          <w:lang w:val="it-IT"/>
+        </w:rPr>
+        <w:t xml:space="preserve"> If the </w:t>
+      </w:r>
+      <w:r>
+        <w:rPr>
+          <w:lang w:val="it-IT"/>
+        </w:rPr>
+        <w:t>parameter text file</w:t>
+      </w:r>
+      <w:r>
+        <w:rPr>
+          <w:lang w:val="it-IT"/>
+        </w:rPr>
+        <w:t xml:space="preserve"> is not present, </w:t>
+      </w:r>
+      <w:r>
+        <w:rPr>
+          <w:lang w:val="it-IT"/>
+        </w:rPr>
+        <w:t xml:space="preserve">the </w:t>
+      </w:r>
+      <w:r>
+        <w:rPr>
+          <w:lang w:val="it-IT"/>
+        </w:rPr>
+        <w:t>user is prompted for some hard-requirement parameters, namely:</w:t>
+      </w:r>
+      <w:r>
+        <w:rPr>
+          <w:lang w:val="it-IT"/>
+        </w:rPr>
+        <w:t xml:space="preserve"> n</w:t>
+      </w:r>
+      <w:r>
+        <w:rPr>
+          <w:lang w:val="it-IT"/>
+        </w:rPr>
+        <w:t>ucleus, magnetic field strength, receiver bandwidth</w:t>
+      </w:r>
+      <w:r>
+        <w:rPr>
+          <w:lang w:val="it-IT"/>
+        </w:rPr>
+        <w:t xml:space="preserve"> and</w:t>
+      </w:r>
+      <w:r>
+        <w:rPr>
+          <w:lang w:val="it-IT"/>
+        </w:rPr>
+        <w:t xml:space="preserve"> echo-time</w:t>
+      </w:r>
+      <w:r>
+        <w:rPr>
+          <w:lang w:val="it-IT"/>
+        </w:rPr>
+        <w:t>.</w:t>
+      </w:r>
+    </w:p>
+    <w:p>
+      <w:pPr>
+        <w:pStyle w:val="Heading3"/>
+        <w:rPr>
+          <w:lang w:val="it-IT"/>
+        </w:rPr>
+      </w:pPr>
+      <w:r>
+        <w:rPr>
+          <w:lang w:val="it-IT"/>
+        </w:rPr>
+        <w:t>Siemens</w:t>
+      </w:r>
+    </w:p>
+    <w:p>
+      <w:pPr>
+        <w:rPr>
+          <w:lang w:val="it-IT"/>
+        </w:rPr>
+      </w:pPr>
+      <w:r>
+        <w:rPr>
+          <w:lang w:val="it-IT"/>
+        </w:rPr>
+        <w:t>The Siemens twix file contains all necessary information</w:t>
+      </w:r>
+    </w:p>
+    <w:p>
+      <w:pPr>
+        <w:pStyle w:val="Heading3"/>
+        <w:rPr>
+          <w:lang w:val="it-IT"/>
+        </w:rPr>
+      </w:pPr>
+      <w:r>
+        <w:rPr>
+          <w:lang w:val="it-IT"/>
+        </w:rPr>
+        <w:t>Noise</w:t>
+      </w:r>
+      <w:r>
+        <w:rPr>
+          <w:lang w:val="it-IT"/>
+        </w:rPr>
+        <w:t xml:space="preserve"> Measurement</w:t>
+      </w:r>
+    </w:p>
+    <w:p>
+      <w:pPr>
+        <w:jc w:val="both"/>
+        <w:rPr>
+          <w:lang w:val="it-IT"/>
+        </w:rPr>
+      </w:pPr>
+      <w:r>
+        <w:rPr>
+          <w:lang w:val="it-IT"/>
+        </w:rPr>
+        <w:t>A</w:t>
+      </w:r>
+      <w:r>
+        <w:rPr>
+          <w:lang w:val="it-IT"/>
+        </w:rPr>
+        <w:t xml:space="preserve"> seperate</w:t>
+      </w:r>
+      <w:r>
+        <w:rPr>
+          <w:lang w:val="it-IT"/>
+        </w:rPr>
+        <w:t xml:space="preserve"> noise measurement can</w:t>
+      </w:r>
+      <w:r>
+        <w:rPr>
+          <w:lang w:val="it-IT"/>
+        </w:rPr>
+        <w:t xml:space="preserve"> be added during the conversion process.</w:t>
+      </w:r>
+    </w:p>
+    <w:p>
+      <w:pPr>
+        <w:jc w:val="both"/>
+        <w:rPr>
+          <w:lang w:val="it-IT"/>
+        </w:rPr>
+      </w:pPr>
+      <w:r>
+        <w:rPr>
+          <w:lang w:val="it-IT"/>
+        </w:rPr>
+        <w:t>List/data also has noise data – if not presented will use that. Siemens standard CSI data does not have this and therefor uses voxel noise.</w:t>
+      </w:r>
+    </w:p>
+    <w:p>
+      <w:pPr>
+        <w:pStyle w:val="Heading1"/>
+        <w:rPr>
           <w:lang w:val="en-US"/>
         </w:rPr>
       </w:pPr>
-      <w:bookmarkStart w:id="3" w:name="_Toc228799185"/>
+      <w:bookmarkStart w:id="8" w:name="_Toc231916337"/>
       <w:r>
         <w:rPr>
           <w:lang w:val="en-US"/>
         </w:rPr>
         <w:t>Process Data</w:t>
       </w:r>
-      <w:bookmarkEnd w:id="3"/>
+      <w:bookmarkEnd w:id="8"/>
     </w:p>
     <w:sectPr>
-      <w:headerReference w:type="default" r:id="rId9"/>
+      <w:headerReference w:type="default" r:id="rId12"/>
       <w:pgSz w:w="11906" w:h="16838"/>
       <w:pgMar w:top="1440" w:right="1440" w:bottom="1440" w:left="1440" w:header="708" w:footer="708" w:gutter="0"/>
       <w:cols w:space="708"/>
@@ -738,16 +2459,8 @@
       <w:rPr>
         <w:lang w:val="en-US"/>
       </w:rPr>
-      <w:t xml:space="preserve"> </w:t>
+      <w:t xml:space="preserve"> MeMRI</w:t>
     </w:r>
-    <w:proofErr w:type="spellStart"/>
-    <w:r>
-      <w:rPr>
-        <w:lang w:val="en-US"/>
-      </w:rPr>
-      <w:t>MeMRI</w:t>
-    </w:r>
-    <w:proofErr w:type="spellEnd"/>
     <w:r>
       <w:rPr>
         <w:lang w:val="en-US"/>
@@ -761,6 +2474,103 @@
     </w:pPr>
   </w:p>
 </w:hdr>
+</file>
+
+<file path=word/numbering.xml><?xml version="1.0" encoding="utf-8"?>
+<w:numbering xmlns:wpc="http://schemas.microsoft.com/office/word/2010/wordprocessingCanvas" xmlns:cx="http://schemas.microsoft.com/office/drawing/2014/chartex" xmlns:cx1="http://schemas.microsoft.com/office/drawing/2015/9/8/chartex" xmlns:cx2="http://schemas.microsoft.com/office/drawing/2015/10/21/chartex" xmlns:cx3="http://schemas.microsoft.com/office/drawing/2016/5/9/chartex" xmlns:cx4="http://schemas.microsoft.com/office/drawing/2016/5/10/chartex" xmlns:cx5="http://schemas.microsoft.com/office/drawing/2016/5/11/chartex" xmlns:cx6="http://schemas.microsoft.com/office/drawing/2016/5/12/chartex" xmlns:cx7="http://schemas.microsoft.com/office/drawing/2016/5/13/chartex" xmlns:cx8="http://schemas.microsoft.com/office/drawing/2016/5/14/chartex" xmlns:mc="http://schemas.openxmlformats.org/markup-compatibility/2006" xmlns:aink="http://schemas.microsoft.com/office/drawing/2016/ink" xmlns:am3d="http://schemas.microsoft.com/office/drawing/2017/model3d" xmlns:o="urn:schemas-microsoft-com:office:office" xmlns:oel="http://schemas.microsoft.com/office/2019/extlst" xmlns:r="http://schemas.openxmlformats.org/officeDocument/2006/relationships" xmlns:m="http://schemas.openxmlformats.org/officeDocument/2006/math" xmlns:v="urn:schemas-microsoft-com:vml" xmlns:wp14="http://schemas.microsoft.com/office/word/2010/wordprocessingDrawing" xmlns:wp="http://schemas.openxmlformats.org/drawingml/2006/wordprocessingDrawing" xmlns:w10="urn:schemas-microsoft-com:office:word" xmlns:w="http://schemas.openxmlformats.org/wordprocessingml/2006/main" xmlns:w14="http://schemas.microsoft.com/office/word/2010/wordml" xmlns:w15="http://schemas.microsoft.com/office/word/2012/wordml" xmlns:w16cex="http://schemas.microsoft.com/office/word/2018/wordml/cex" xmlns:w16cid="http://schemas.microsoft.com/office/word/2016/wordml/cid" xmlns:w16="http://schemas.microsoft.com/office/word/2018/wordml" xmlns:w16du="http://schemas.microsoft.com/office/word/2023/wordml/word16du" xmlns:w16sdtdh="http://schemas.microsoft.com/office/word/2020/wordml/sdtdatahash" xmlns:w16sdtfl="http://schemas.microsoft.com/office/word/2024/wordml/sdtformatlock" xmlns:w16se="http://schemas.microsoft.com/office/word/2015/wordml/symex" xmlns:wpg="http://schemas.microsoft.com/office/word/2010/wordprocessingGroup" xmlns:wpi="http://schemas.microsoft.com/office/word/2010/wordprocessingInk" xmlns:wne="http://schemas.microsoft.com/office/word/2006/wordml" xmlns:wps="http://schemas.microsoft.com/office/word/2010/wordprocessingShape" mc:Ignorable="w14 w15 w16se w16cid w16 w16cex w16sdtdh w16sdtfl w16du wp14">
+  <w:abstractNum w:abstractNumId="0" w15:restartNumberingAfterBreak="0">
+    <w:nsid w:val="4CE77B78"/>
+    <w:multiLevelType w:val="hybridMultilevel"/>
+    <w:tmpl w:val="EDA2083E"/>
+    <w:lvl w:ilvl="0" w:tplc="1000000F">
+      <w:start w:val="1"/>
+      <w:numFmt w:val="decimal"/>
+      <w:lvlText w:val="%1."/>
+      <w:lvlJc w:val="left"/>
+      <w:pPr>
+        <w:ind w:left="720" w:hanging="360"/>
+      </w:pPr>
+      <w:rPr>
+        <w:rFonts w:hint="default"/>
+      </w:rPr>
+    </w:lvl>
+    <w:lvl w:ilvl="1" w:tplc="10000019" w:tentative="1">
+      <w:start w:val="1"/>
+      <w:numFmt w:val="lowerLetter"/>
+      <w:lvlText w:val="%2."/>
+      <w:lvlJc w:val="left"/>
+      <w:pPr>
+        <w:ind w:left="1440" w:hanging="360"/>
+      </w:pPr>
+    </w:lvl>
+    <w:lvl w:ilvl="2" w:tplc="1000001B" w:tentative="1">
+      <w:start w:val="1"/>
+      <w:numFmt w:val="lowerRoman"/>
+      <w:lvlText w:val="%3."/>
+      <w:lvlJc w:val="right"/>
+      <w:pPr>
+        <w:ind w:left="2160" w:hanging="180"/>
+      </w:pPr>
+    </w:lvl>
+    <w:lvl w:ilvl="3" w:tplc="1000000F" w:tentative="1">
+      <w:start w:val="1"/>
+      <w:numFmt w:val="decimal"/>
+      <w:lvlText w:val="%4."/>
+      <w:lvlJc w:val="left"/>
+      <w:pPr>
+        <w:ind w:left="2880" w:hanging="360"/>
+      </w:pPr>
+    </w:lvl>
+    <w:lvl w:ilvl="4" w:tplc="10000019" w:tentative="1">
+      <w:start w:val="1"/>
+      <w:numFmt w:val="lowerLetter"/>
+      <w:lvlText w:val="%5."/>
+      <w:lvlJc w:val="left"/>
+      <w:pPr>
+        <w:ind w:left="3600" w:hanging="360"/>
+      </w:pPr>
+    </w:lvl>
+    <w:lvl w:ilvl="5" w:tplc="1000001B" w:tentative="1">
+      <w:start w:val="1"/>
+      <w:numFmt w:val="lowerRoman"/>
+      <w:lvlText w:val="%6."/>
+      <w:lvlJc w:val="right"/>
+      <w:pPr>
+        <w:ind w:left="4320" w:hanging="180"/>
+      </w:pPr>
+    </w:lvl>
+    <w:lvl w:ilvl="6" w:tplc="1000000F" w:tentative="1">
+      <w:start w:val="1"/>
+      <w:numFmt w:val="decimal"/>
+      <w:lvlText w:val="%7."/>
+      <w:lvlJc w:val="left"/>
+      <w:pPr>
+        <w:ind w:left="5040" w:hanging="360"/>
+      </w:pPr>
+    </w:lvl>
+    <w:lvl w:ilvl="7" w:tplc="10000019" w:tentative="1">
+      <w:start w:val="1"/>
+      <w:numFmt w:val="lowerLetter"/>
+      <w:lvlText w:val="%8."/>
+      <w:lvlJc w:val="left"/>
+      <w:pPr>
+        <w:ind w:left="5760" w:hanging="360"/>
+      </w:pPr>
+    </w:lvl>
+    <w:lvl w:ilvl="8" w:tplc="1000001B" w:tentative="1">
+      <w:start w:val="1"/>
+      <w:numFmt w:val="lowerRoman"/>
+      <w:lvlText w:val="%9."/>
+      <w:lvlJc w:val="right"/>
+      <w:pPr>
+        <w:ind w:left="6480" w:hanging="180"/>
+      </w:pPr>
+    </w:lvl>
+  </w:abstractNum>
+  <w:num w:numId="1" w16cid:durableId="273176934">
+    <w:abstractNumId w:val="0"/>
+  </w:num>
+</w:numbering>
 </file>
 
 <file path=word/styles.xml><?xml version="1.0" encoding="utf-8"?>
@@ -1163,6 +2973,7 @@
   <w:style w:type="paragraph" w:default="1" w:styleId="Normal">
     <w:name w:val="Normal"/>
     <w:qFormat/>
+    <w:rsid w:val="00C23B5A"/>
   </w:style>
   <w:style w:type="paragraph" w:styleId="Heading1">
     <w:name w:val="heading 1"/>
@@ -1213,7 +3024,6 @@
     <w:next w:val="Normal"/>
     <w:link w:val="Heading3Char"/>
     <w:uiPriority w:val="9"/>
-    <w:semiHidden/>
     <w:unhideWhenUsed/>
     <w:qFormat/>
     <w:rsid w:val="00E774DA"/>
@@ -1420,7 +3230,6 @@
     <w:basedOn w:val="DefaultParagraphFont"/>
     <w:link w:val="Heading3"/>
     <w:uiPriority w:val="9"/>
-    <w:semiHidden/>
     <w:rsid w:val="00E774DA"/>
     <w:rPr>
       <w:rFonts w:eastAsiaTheme="majorEastAsia" w:cstheme="majorBidi"/>
@@ -1789,6 +3598,19 @@
       <w:color w:val="605E5C"/>
       <w:shd w:val="clear" w:color="auto" w:fill="E1DFDD"/>
     </w:rPr>
+  </w:style>
+  <w:style w:type="paragraph" w:styleId="TOC3">
+    <w:name w:val="toc 3"/>
+    <w:basedOn w:val="Normal"/>
+    <w:next w:val="Normal"/>
+    <w:autoRedefine/>
+    <w:uiPriority w:val="39"/>
+    <w:unhideWhenUsed/>
+    <w:rsid w:val="00FD7FAB"/>
+    <w:pPr>
+      <w:spacing w:after="100"/>
+      <w:ind w:left="480"/>
+    </w:pPr>
   </w:style>
 </w:styles>
 </file>

</xml_diff>